<commit_message>
docs(report): update to ESP32 DevKit V1 with CCTV actual and mobile prototype vision
</commit_message>
<xml_diff>
--- a/Report/Smart_Room_Spatial_Automation_Project_Report.docx
+++ b/Report/Smart_Room_Spatial_Automation_Project_Report.docx
@@ -404,7 +404,7 @@
           <w:color w:val="000000"/>
           <w:sz w:val="22"/>
         </w:rPr>
-        <w:t>The hardware tier integrates an opto-isolated multi-channel relay module within a zero-wiring retrofit smart extension box, complemented by dual infrared directional doorway counters that track net occupancy. The system supports dual microcontroller configurations (ESP32 DevKit and autonomous ESP32-CAM) alongside a real-time web-based Digital Twin monitoring dashboard. Experimental evaluations demonstrate an energy consumption reduction of 42.6% compared to uncontrolled baseline operations, validating the practical feasibility, safety, and scalability of the architecture.</w:t>
+        <w:t>The hardware tier integrates an opto-isolated multi-channel relay module within a zero-wiring retrofit smart extension box, complemented by dual infrared directional doorway counters that track net occupancy. The system utilizes the ESP32 DevKit V1 for robust embedded switching and sensor telemetry, interfacing with institutional CCTV cameras for actual large-scale classroom deployments and mobile smartphone camera feeds for prototype testbeds, alongside a real-time web-based Digital Twin monitoring dashboard. Experimental evaluations demonstrate an energy consumption reduction of 42.6% compared to uncontrolled baseline operations, validating the practical feasibility, safety, and scalability of the architecture.</w:t>
       </w:r>
     </w:p>
     <w:p>
@@ -1101,7 +1101,7 @@
               <w:rPr>
                 <w:sz w:val="17"/>
               </w:rPr>
-              <w:t xml:space="preserve">  ESP32 Pin Allocation Matrix &amp; ESP32-CAM Setup</w:t>
+              <w:t xml:space="preserve">  ESP32 Pin Allocation Matrix &amp; Vision Feed Setup</w:t>
             </w:r>
           </w:p>
         </w:tc>
@@ -2079,7 +2079,7 @@
               <w:rPr>
                 <w:sz w:val="17"/>
               </w:rPr>
-              <w:t xml:space="preserve">  Autonomous ESP32-CAM Firmware (esp32_cam_smart_room.ino)</w:t>
+              <w:t xml:space="preserve">  ESP32 Prototype Controller Firmware (esp32_prototype_controller.ino)</w:t>
             </w:r>
           </w:p>
         </w:tc>
@@ -2337,7 +2337,7 @@
               <w:rPr>
                 <w:sz w:val="17"/>
               </w:rPr>
-              <w:t xml:space="preserve">  ESP32-CAM Standalone Schematic &amp; Pinout</w:t>
+              <w:t xml:space="preserve">  Classroom CCTV &amp; Mobile Smartphone Vision Capture Setup</w:t>
             </w:r>
           </w:p>
         </w:tc>
@@ -3244,7 +3244,7 @@
               <w:rPr>
                 <w:sz w:val="19"/>
               </w:rPr>
-              <w:t>ESP32-CAM Standalone Pinout and Wiring Schematic</w:t>
+              <w:t>Classroom CCTV &amp; Mobile Camera Vision Setup Schematic</w:t>
             </w:r>
           </w:p>
         </w:tc>
@@ -4873,7 +4873,7 @@
           <w:color w:val="000000"/>
           <w:sz w:val="22"/>
         </w:rPr>
-        <w:t>Sensing and Vision Ingestion Tier: Encompasses dual infrared obstacle sensors deployed at the physical doorway threshold to log visitor entrance/exit transitions, paired with an overhead vision sensor (USB webcam, Windows Phone Link camera, or autonomous ESP32-CAM) capturing the room's spatial plane.</w:t>
+        <w:t>Sensing and Vision Ingestion Tier: Encompasses dual infrared obstacle sensors deployed at the physical doorway threshold to log visitor entrance/exit transitions, paired with an overhead vision capture stream (institutional CCTV overhead cameras for full-scale classroom deployment, or mobile smartphone Wi-Fi IP / Phone Link cameras for prototype laboratory validation) capturing the room's spatial plane.</w:t>
       </w:r>
     </w:p>
     <w:p>
@@ -5092,7 +5092,7 @@
           <w:b/>
           <w:sz w:val="25"/>
         </w:rPr>
-        <w:t>2.4 ESP32 Pin Allocation Matrix &amp; ESP32-CAM Setup</w:t>
+        <w:t>2.4 ESP32 Pin Allocation Matrix &amp; Embedded I/O Interface</w:t>
       </w:r>
     </w:p>
     <w:p>
@@ -5622,7 +5622,7 @@
           <w:b/>
           <w:sz w:val="25"/>
         </w:rPr>
-        <w:t>2.5 ESP32-CAM (AI-Thinker) Standalone Module Specifications</w:t>
+        <w:t>2.5 Vision Ingestion Architecture: Institutional CCTV Feeds &amp; Mobile Camera Testbed</w:t>
       </w:r>
     </w:p>
     <w:p>
@@ -5638,7 +5638,7 @@
           <w:color w:val="000000"/>
           <w:sz w:val="23"/>
         </w:rPr>
-        <w:t>In addition to the standard ESP32 DevKit, the project incorporates support for the AI-Thinker ESP32-CAM module. This compact 27x40.5mm board integrates an Omnivision OV2640 2-Megapixel camera sensor and 4 MB of external pseudo-static RAM (PSRAM). The PSRAM expansion allows the ESP32-CAM to buffer full UXGA (1600x1200) or SVGA (800x600) JPEG frames inside memory, serving continuous MJPEG HTTP video streams directly over Wi-Fi without requiring an external video capture card.</w:t>
+        <w:t>The computer vision ingestion architecture supports two distinct operational modes tailored for scalable real-world deployment and laboratory prototyping: (1) Actual Classroom Implementation: Existing institutional CCTV ceiling-mounted surveillance cameras stream overhead RTSP/H.264 video over the campus LAN directly to the spatial inference server, requiring zero additional camera hardware investment; (2) Prototype Testbed Validation: Mobile smartphone cameras stream high-definition video over Wi-Fi via the IP Webcam protocol or Windows Phone Link wireless camera virtualization, alongside USB webcams. Both sources deliver normalized overhead video frames to the YOLO spatial reasoning pipeline while the dedicated ESP32 DevKit V1 manages physical actuation.</w:t>
       </w:r>
     </w:p>
     <w:p>
@@ -8389,7 +8389,7 @@
           <w:b/>
           <w:sz w:val="25"/>
         </w:rPr>
-        <w:t>5.3 ESP32-CAM Autonomous Controller Firmware (esp32_cam_smart_room.ino)</w:t>
+        <w:t>5.3 ESP32 Prototype Controller Firmware (esp32_prototype_controller.ino)</w:t>
       </w:r>
     </w:p>
     <w:p>
@@ -8405,7 +8405,7 @@
           <w:color w:val="000000"/>
           <w:sz w:val="23"/>
         </w:rPr>
-        <w:t>Listing 5.3 presents the camera configuration and frame-streaming web server for the standalone ESP32-CAM module:</w:t>
+        <w:t>Listing 5.3 presents the prototype ESP32 firmware implementation featuring doorway people counting, vacancy auto-off logic, and dual-unit workstation switching:</w:t>
       </w:r>
     </w:p>
     <w:p>
@@ -8420,101 +8420,103 @@
           <w:color w:val="1E1E1E"/>
           <w:sz w:val="17"/>
         </w:rPr>
-        <w:t>#include "esp_camera.h"</w:t>
-        <w:br/>
         <w:t>#include &lt;WiFi.h&gt;</w:t>
         <w:br/>
         <w:t>#include &lt;WebServer.h&gt;</w:t>
         <w:br/>
         <w:br/>
-        <w:t>// CAMERA_MODEL_AI_THINKER PIN MAP</w:t>
+        <w:t>// PIN ASSIGNMENTS (ESP32 DevKit V1)</w:t>
         <w:br/>
-        <w:t>#define PWDN_GPIO_NUM     32</w:t>
+        <w:t>const int PIN_UNIT_1 = 25;      // Relay Ch 1: Desk 1 (Fan 1 + Light 1)</w:t>
         <w:br/>
-        <w:t>#define RESET_GPIO_NUM    -1</w:t>
+        <w:t>const int PIN_UNIT_2 = 26;      // Relay Ch 2: Desk 2 (Fan 2 + Light 2)</w:t>
         <w:br/>
-        <w:t>#define XCLK_GPIO_NUM      0</w:t>
+        <w:t>const int PIN_SENSOR_OUT = 18;  // Outer doorway IR sensor</w:t>
         <w:br/>
-        <w:t>#define SIOD_GPIO_NUM     26</w:t>
+        <w:t>const int PIN_SENSOR_IN  = 19;  // Inner doorway IR sensor</w:t>
         <w:br/>
-        <w:t>#define SIOC_GPIO_NUM     27</w:t>
+        <w:t>#define SENSOR_TRIGGERED LOW</w:t>
         <w:br/>
-        <w:t>#define Y9_GPIO_NUM       35</w:t>
+        <w:t>#define RELAY_ON LOW</w:t>
         <w:br/>
-        <w:t>#define Y8_GPIO_NUM       34</w:t>
-        <w:br/>
-        <w:t>#define Y7_GPIO_NUM       39</w:t>
-        <w:br/>
-        <w:t>#define Y6_GPIO_NUM       36</w:t>
-        <w:br/>
-        <w:t>#define Y5_GPIO_NUM       21</w:t>
-        <w:br/>
-        <w:t>#define Y4_GPIO_NUM       19</w:t>
-        <w:br/>
-        <w:t>#define Y3_GPIO_NUM       18</w:t>
-        <w:br/>
-        <w:t>#define Y2_GPIO_NUM        5</w:t>
-        <w:br/>
-        <w:t>#define VSYNC_GPIO_NUM    25</w:t>
-        <w:br/>
-        <w:t>#define HREF_GPIO_NUM     23</w:t>
-        <w:br/>
-        <w:t>#define PCLK_GPIO_NUM     22</w:t>
+        <w:t>#define RELAY_OFF HIGH</w:t>
         <w:br/>
         <w:br/>
-        <w:t>void initCamera() {</w:t>
+        <w:t>int personCount = 0;            // Live classroom occupancy</w:t>
         <w:br/>
-        <w:t xml:space="preserve">  camera_config_t config;</w:t>
+        <w:t>bool unit1State = false, unit2State = false;</w:t>
         <w:br/>
-        <w:t xml:space="preserve">  config.ledc_channel = LEDC_CHANNEL_0;</w:t>
+        <w:t>bool outTriggered = false, inTriggered = false;</w:t>
         <w:br/>
-        <w:t xml:space="preserve">  config.ledc_timer = LEDC_TIMER_0;</w:t>
+        <w:t>unsigned long triggerTime = 0;</w:t>
         <w:br/>
-        <w:t xml:space="preserve">  config.pin_d0 = Y2_GPIO_NUM;</w:t>
+        <w:t>const unsigned long PASS_TIMEOUT = 2500;</w:t>
         <w:br/>
-        <w:t xml:space="preserve">  config.pin_d1 = Y3_GPIO_NUM;</w:t>
+        <w:t>WebServer server(80);</w:t>
         <w:br/>
-        <w:t xml:space="preserve">  config.pin_d2 = Y4_GPIO_NUM;</w:t>
         <w:br/>
-        <w:t xml:space="preserve">  config.pin_d3 = Y5_GPIO_NUM;</w:t>
+        <w:t>void setAppliances(bool u1, bool u2) {</w:t>
         <w:br/>
-        <w:t xml:space="preserve">  config.pin_d4 = Y6_GPIO_NUM;</w:t>
+        <w:t xml:space="preserve">  unit1State = u1; unit2State = u2;</w:t>
         <w:br/>
-        <w:t xml:space="preserve">  config.pin_d5 = Y7_GPIO_NUM;</w:t>
+        <w:t xml:space="preserve">  digitalWrite(PIN_UNIT_1, unit1State ? RELAY_ON : RELAY_OFF);</w:t>
         <w:br/>
-        <w:t xml:space="preserve">  config.pin_d6 = Y8_GPIO_NUM;</w:t>
+        <w:t xml:space="preserve">  digitalWrite(PIN_UNIT_2, unit2State ? RELAY_ON : RELAY_OFF);</w:t>
         <w:br/>
-        <w:t xml:space="preserve">  config.pin_d7 = Y9_GPIO_NUM;</w:t>
+        <w:t>}</w:t>
         <w:br/>
-        <w:t xml:space="preserve">  config.pin_xclk = XCLK_GPIO_NUM;</w:t>
         <w:br/>
-        <w:t xml:space="preserve">  config.pin_pclk = PCLK_GPIO_NUM;</w:t>
+        <w:t>void updateDoorwayCounter() {</w:t>
         <w:br/>
-        <w:t xml:space="preserve">  config.pin_vsync = VSYNC_GPIO_NUM;</w:t>
+        <w:t xml:space="preserve">  int outVal = digitalRead(PIN_SENSOR_OUT);</w:t>
         <w:br/>
-        <w:t xml:space="preserve">  config.pin_href = HREF_GPIO_NUM;</w:t>
+        <w:t xml:space="preserve">  int inVal  = digitalRead(PIN_SENSOR_IN);</w:t>
         <w:br/>
-        <w:t xml:space="preserve">  config.pin_sscb_sda = SIOD_GPIO_NUM;</w:t>
+        <w:t xml:space="preserve">  unsigned long now = millis();</w:t>
         <w:br/>
-        <w:t xml:space="preserve">  config.pin_sscb_scl = SIOC_GPIO_NUM;</w:t>
         <w:br/>
-        <w:t xml:space="preserve">  config.pin_pwdn = PWDN_GPIO_NUM;</w:t>
+        <w:t xml:space="preserve">  if (outVal == SENSOR_TRIGGERED &amp;&amp; !outTriggered &amp;&amp; !inTriggered) {</w:t>
         <w:br/>
-        <w:t xml:space="preserve">  config.pin_reset = RESET_GPIO_NUM;</w:t>
+        <w:t xml:space="preserve">    outTriggered = true; triggerTime = now; delay(40);</w:t>
         <w:br/>
-        <w:t xml:space="preserve">  config.xclk_freq_hz = 20000000;</w:t>
+        <w:t xml:space="preserve">  } else if (inVal == SENSOR_TRIGGERED &amp;&amp; !inTriggered &amp;&amp; !outTriggered) {</w:t>
         <w:br/>
-        <w:t xml:space="preserve">  config.pixel_format = PIXFORMAT_JPEG;</w:t>
+        <w:t xml:space="preserve">    inTriggered = true; triggerTime = now; delay(40);</w:t>
         <w:br/>
-        <w:t xml:space="preserve">  config.frame_size = FRAMESIZE_SVGA; // 800x600 resolution</w:t>
+        <w:t xml:space="preserve">  }</w:t>
         <w:br/>
-        <w:t xml:space="preserve">  config.jpeg_quality = 12;</w:t>
         <w:br/>
-        <w:t xml:space="preserve">  config.fb_count = 2;</w:t>
+        <w:t xml:space="preserve">  // Entry sequence (OUT -&gt; IN): Increment count</w:t>
         <w:br/>
-        <w:t xml:space="preserve">  esp_err_t err = esp_camera_init(&amp;config);</w:t>
+        <w:t xml:space="preserve">  if (outTriggered &amp;&amp; inVal == SENSOR_TRIGGERED) {</w:t>
         <w:br/>
-        <w:t xml:space="preserve">  if (err != ESP_OK) { Serial.println("Camera Init Failed!"); }</w:t>
+        <w:t xml:space="preserve">    personCount++;</w:t>
+        <w:br/>
+        <w:t xml:space="preserve">    outTriggered = false; inTriggered = false; delay(350);</w:t>
+        <w:br/>
+        <w:t xml:space="preserve">  }</w:t>
+        <w:br/>
+        <w:t xml:space="preserve">  // Exit sequence (IN -&gt; OUT): Decrement count &amp; Auto-Off if empty</w:t>
+        <w:br/>
+        <w:t xml:space="preserve">  if (inTriggered &amp;&amp; outVal == SENSOR_TRIGGERED) {</w:t>
+        <w:br/>
+        <w:t xml:space="preserve">    if (personCount &gt; 0) personCount--;</w:t>
+        <w:br/>
+        <w:t xml:space="preserve">    outTriggered = false; inTriggered = false;</w:t>
+        <w:br/>
+        <w:t xml:space="preserve">    if (personCount == 0) { setAppliances(false, false); } // Auto-Off Rule</w:t>
+        <w:br/>
+        <w:t xml:space="preserve">    delay(350);</w:t>
+        <w:br/>
+        <w:t xml:space="preserve">  }</w:t>
+        <w:br/>
+        <w:t xml:space="preserve">  // Timeout reset for partial passage</w:t>
+        <w:br/>
+        <w:t xml:space="preserve">  if ((outTriggered || inTriggered) &amp;&amp; (now - triggerTime &gt; PASS_TIMEOUT)) {</w:t>
+        <w:br/>
+        <w:t xml:space="preserve">    outTriggered = false; inTriggered = false;</w:t>
+        <w:br/>
+        <w:t xml:space="preserve">  }</w:t>
         <w:br/>
         <w:t>}</w:t>
       </w:r>
@@ -8588,9 +8590,9 @@
         <w:br/>
         <w:t>CAMERA_SOURCE = 0  # 0 for Phone Link / Local Webcam</w:t>
         <w:br/>
-        <w:t>IP_CAMERA_URL = "http://10.105.4.198:8080/video"</w:t>
+        <w:t>IP_CAMERA_URL = "http://192.168.43.100:8080/video"</w:t>
         <w:br/>
-        <w:t>ESP32_IP = "http://10.46.38.116"</w:t>
+        <w:t>ESP32_IP = "http://192.168.43.125"</w:t>
         <w:br/>
         <w:br/>
         <w:t>SCAN_INTERVAL_SEC = 10.0   # Scans 1 frame every 10 seconds for power efficiency</w:t>
@@ -8929,7 +8931,7 @@
         <w:br/>
         <w:t xml:space="preserve">      try {</w:t>
         <w:br/>
-        <w:t xml:space="preserve">        const res = await fetch('http://10.46.38.116/status');</w:t>
+        <w:t xml:space="preserve">        const res = await fetch('http://192.168.43.125/status');</w:t>
         <w:br/>
         <w:t xml:space="preserve">        const data = await res.json();</w:t>
         <w:br/>
@@ -9104,7 +9106,7 @@
           <w:b/>
           <w:sz w:val="25"/>
         </w:rPr>
-        <w:t>6.3 ESP32-CAM Standalone Circuit Schematic &amp; Pin Wiring</w:t>
+        <w:t>6.3 Classroom CCTV &amp; Mobile Smartphone Vision Capture Setup</w:t>
       </w:r>
     </w:p>
     <w:p>
@@ -9120,7 +9122,7 @@
           <w:color w:val="000000"/>
           <w:sz w:val="23"/>
         </w:rPr>
-        <w:t>For autonomous deployments eliminating the external PC vision server, Figure 6.2 illustrates the standalone ESP32-CAM interconnection schematic, detailing power routing, relay driving, and camera pinouts:</w:t>
+        <w:t>For actual institutional deployment, overhead classroom CCTV surveillance cameras stream video over RTSP/LAN to the host inference computer. For prototype testbeds, a mobile smartphone camera streaming via Wi-Fi IP Webcam or Windows Phone Link is mounted overhead. Figure 6.2 illustrates the dual vision capture architecture and network signal routing to the ESP32 DevKit:</w:t>
       </w:r>
     </w:p>
     <w:p>
@@ -9131,7 +9133,7 @@
       <w:r>
         <w:drawing>
           <wp:inline xmlns:a="http://schemas.openxmlformats.org/drawingml/2006/main" xmlns:pic="http://schemas.openxmlformats.org/drawingml/2006/picture">
-            <wp:extent cx="4754880" cy="2653887"/>
+            <wp:extent cx="4754880" cy="2873453"/>
             <wp:docPr id="3" name="Picture 3"/>
             <wp:cNvGraphicFramePr>
               <a:graphicFrameLocks noChangeAspect="1"/>
@@ -9140,7 +9142,7 @@
               <a:graphicData uri="http://schemas.openxmlformats.org/drawingml/2006/picture">
                 <pic:pic>
                   <pic:nvPicPr>
-                    <pic:cNvPr id="0" name="esp32_cam_circuit_diagram.jpg"/>
+                    <pic:cNvPr id="0" name="cctv_mobile_vision_setup.jpg"/>
                     <pic:cNvPicPr/>
                   </pic:nvPicPr>
                   <pic:blipFill>
@@ -9152,7 +9154,7 @@
                   <pic:spPr>
                     <a:xfrm>
                       <a:off x="0" y="0"/>
-                      <a:ext cx="4754880" cy="2653887"/>
+                      <a:ext cx="4754880" cy="2873453"/>
                     </a:xfrm>
                     <a:prstGeom prst="rect"/>
                   </pic:spPr>
@@ -9173,7 +9175,7 @@
           <w:b/>
           <w:sz w:val="19"/>
         </w:rPr>
-        <w:t>Figure 6.2: ESP32-CAM Standalone Pinout and Wiring Schematic</w:t>
+        <w:t>Figure 6.2: Classroom CCTV &amp; Mobile Camera Vision Setup Schematic</w:t>
       </w:r>
     </w:p>
     <w:p>
@@ -11475,7 +11477,7 @@
           <w:rFonts w:ascii="Times New Roman" w:hAnsi="Times New Roman"/>
           <w:sz w:val="19"/>
         </w:rPr>
-        <w:t>[4] AI-Thinker Technology, "ESP32-CAM Development Board Specification and OV2640 Interfacing Guide," Shenzhen AI-Thinker Co., Ltd., 2022.</w:t>
+        <w:t>[4] ONVIF, "ONVIF Profile S Specification for IP-Based Video Surveillance and RTSP Streaming Systems," Open Network Video Interface Forum, Version 2.6, 2022.</w:t>
       </w:r>
     </w:p>
     <w:p>

</xml_diff>